<commit_message>
addressed comments and CI
</commit_message>
<xml_diff>
--- a/Output/Ria_table_1_descriptive_characteristics.docx
+++ b/Output/Ria_table_1_descriptive_characteristics.docx
@@ -25,7 +25,7 @@
         <w:ind w:left="60" w:right="60" w:firstLine="0" w:firstLineChars="0"/>
       </w:pPr>
       <w:r>
-        <w:t xml:space="preserve">**Table 1. Overall Descriptive Characteristics of MIDUS Participants**</w:t>
+        <w:t xml:space="preserve">Table 1. Overall Descriptive Characteristics of MIDUS Participants</w:t>
       </w:r>
     </w:p>
     <w:tbl xmlns:a="http://schemas.openxmlformats.org/drawingml/2006/main" xmlns:pic="http://schemas.openxmlformats.org/drawingml/2006/picture">
@@ -35,12 +35,12 @@
         <w:tblLook w:firstRow="1" w:lastRow="0" w:firstColumn="0" w:lastColumn="0" w:noHBand="0" w:noVBand="1"/>
       </w:tblPr>
       <w:tblGrid>
-        <w:gridCol w:w="4543"/>
+        <w:gridCol w:w="4811"/>
         <w:gridCol w:w="2576"/>
       </w:tblGrid>
       <w:tr>
         <w:trPr>
-          <w:trHeight w:val="638" w:hRule="auto"/>
+          <w:trHeight w:val="508" w:hRule="auto"/>
           <w:tblHeader/>
         </w:trPr>
         <w:tc>
@@ -149,7 +149,7 @@
                 <w:szCs w:val="22"/>
                 <w:color w:val="000000"/>
               </w:rPr>
-              <w:t xml:space="preserve">N = 1,156</w:t>
+              <w:t xml:space="preserve">N = 1,155</w:t>
             </w:r>
           </w:p>
         </w:tc>
@@ -264,7 +264,7 @@
                 <w:szCs w:val="22"/>
                 <w:color w:val="000000"/>
               </w:rPr>
-              <w:t xml:space="preserve">50.53 (12.38)</w:t>
+              <w:t xml:space="preserve">50.52 (12.38)</w:t>
             </w:r>
           </w:p>
         </w:tc>
@@ -494,7 +494,7 @@
                 <w:szCs w:val="22"/>
                 <w:color w:val="000000"/>
               </w:rPr>
-              <w:t xml:space="preserve">519 (44.9%)</w:t>
+              <w:t xml:space="preserve">518 (44.8%)</w:t>
             </w:r>
           </w:p>
         </w:tc>
@@ -609,7 +609,7 @@
                 <w:szCs w:val="22"/>
                 <w:color w:val="000000"/>
               </w:rPr>
-              <w:t xml:space="preserve">637 (55.1%)</w:t>
+              <w:t xml:space="preserve">637 (55.2%)</w:t>
             </w:r>
           </w:p>
         </w:tc>
@@ -839,7 +839,7 @@
                 <w:szCs w:val="22"/>
                 <w:color w:val="000000"/>
               </w:rPr>
-              <w:t xml:space="preserve">764 (66.1%)</w:t>
+              <w:t xml:space="preserve">763 (66.1%)</w:t>
             </w:r>
           </w:p>
         </w:tc>
@@ -1414,7 +1414,7 @@
                 <w:szCs w:val="22"/>
                 <w:color w:val="000000"/>
               </w:rPr>
-              <w:t xml:space="preserve">680 (58.8%)</w:t>
+              <w:t xml:space="preserve">679 (58.8%)</w:t>
             </w:r>
           </w:p>
         </w:tc>
@@ -2219,7 +2219,7 @@
                 <w:szCs w:val="22"/>
                 <w:color w:val="000000"/>
               </w:rPr>
-              <w:t xml:space="preserve">547 (47.3%)</w:t>
+              <w:t xml:space="preserve">546 (47.3%)</w:t>
             </w:r>
           </w:p>
         </w:tc>
@@ -2564,7 +2564,7 @@
                 <w:szCs w:val="22"/>
                 <w:color w:val="000000"/>
               </w:rPr>
-              <w:t xml:space="preserve">671 (58.0%)</w:t>
+              <w:t xml:space="preserve">671 (58.1%)</w:t>
             </w:r>
           </w:p>
         </w:tc>
@@ -2679,7 +2679,7 @@
                 <w:szCs w:val="22"/>
                 <w:color w:val="000000"/>
               </w:rPr>
-              <w:t xml:space="preserve">325 (28.1%)</w:t>
+              <w:t xml:space="preserve">324 (28.1%)</w:t>
             </w:r>
           </w:p>
         </w:tc>
@@ -2794,7 +2794,7 @@
                 <w:szCs w:val="22"/>
                 <w:color w:val="000000"/>
               </w:rPr>
-              <w:t xml:space="preserve">160 (13.8%)</w:t>
+              <w:t xml:space="preserve">160 (13.9%)</w:t>
             </w:r>
           </w:p>
         </w:tc>
@@ -3139,7 +3139,7 @@
                 <w:szCs w:val="22"/>
                 <w:color w:val="000000"/>
               </w:rPr>
-              <w:t xml:space="preserve">308 (26.6%)</w:t>
+              <w:t xml:space="preserve">308 (26.7%)</w:t>
             </w:r>
           </w:p>
         </w:tc>
@@ -3254,7 +3254,7 @@
                 <w:szCs w:val="22"/>
                 <w:color w:val="000000"/>
               </w:rPr>
-              <w:t xml:space="preserve">210 (18.2%)</w:t>
+              <w:t xml:space="preserve">209 (18.1%)</w:t>
             </w:r>
           </w:p>
         </w:tc>
@@ -3484,7 +3484,7 @@
                 <w:szCs w:val="22"/>
                 <w:color w:val="000000"/>
               </w:rPr>
-              <w:t xml:space="preserve">62,226.10 (60,299.43)</w:t>
+              <w:t xml:space="preserve">62,226.99 (60,326.65)</w:t>
             </w:r>
           </w:p>
         </w:tc>
@@ -3829,7 +3829,7 @@
                 <w:szCs w:val="22"/>
                 <w:color w:val="000000"/>
               </w:rPr>
-              <w:t xml:space="preserve">593 (51.3%)</w:t>
+              <w:t xml:space="preserve">592 (51.3%)</w:t>
             </w:r>
           </w:p>
         </w:tc>
@@ -3944,7 +3944,7 @@
                 <w:szCs w:val="22"/>
                 <w:color w:val="000000"/>
               </w:rPr>
-              <w:t xml:space="preserve">555 (48.0%)</w:t>
+              <w:t xml:space="preserve">555 (48.1%)</w:t>
             </w:r>
           </w:p>
         </w:tc>
@@ -4404,7 +4404,7 @@
                 <w:szCs w:val="22"/>
                 <w:color w:val="000000"/>
               </w:rPr>
-              <w:t xml:space="preserve">30.06 (7.15)</w:t>
+              <w:t xml:space="preserve">30.07 (7.15)</w:t>
             </w:r>
           </w:p>
         </w:tc>
@@ -4634,7 +4634,7 @@
                 <w:szCs w:val="22"/>
                 <w:color w:val="000000"/>
               </w:rPr>
-              <w:t xml:space="preserve">0.00 (1.00)</w:t>
+              <w:t xml:space="preserve">0.01 (1.00)</w:t>
             </w:r>
           </w:p>
         </w:tc>
@@ -4871,12 +4871,12 @@
       </w:tr>
       <w:tr>
         <w:trPr>
-          <w:trHeight w:val="608" w:hRule="auto"/>
+          <w:trHeight w:val="618" w:hRule="auto"/>
         </w:trPr>
         <w:tc>
           <w:tcPr>
             <w:tcBorders>
-              <w:bottom w:val="none" w:sz="0" w:space="0" w:color="000000"/>
+              <w:bottom w:val="single" w:sz="8" w:space="0" w:color="000000"/>
               <w:top w:val="none" w:sz="0" w:space="0" w:color="000000"/>
               <w:left w:val="none" w:sz="0" w:space="0" w:color="000000"/>
               <w:right w:val="none" w:sz="0" w:space="0" w:color="000000"/>
@@ -4931,7 +4931,7 @@
         <w:tc>
           <w:tcPr>
             <w:tcBorders>
-              <w:bottom w:val="none" w:sz="0" w:space="0" w:color="000000"/>
+              <w:bottom w:val="single" w:sz="8" w:space="0" w:color="000000"/>
               <w:top w:val="none" w:sz="0" w:space="0" w:color="000000"/>
               <w:left w:val="none" w:sz="0" w:space="0" w:color="000000"/>
               <w:right w:val="none" w:sz="0" w:space="0" w:color="000000"/>
@@ -4980,121 +4980,6 @@
                 <w:color w:val="000000"/>
               </w:rPr>
               <w:t xml:space="preserve">0.00 (1.00)</w:t>
-            </w:r>
-          </w:p>
-        </w:tc>
-      </w:tr>
-      <w:tr>
-        <w:trPr>
-          <w:trHeight w:val="623" w:hRule="auto"/>
-        </w:trPr>
-        <w:tc>
-          <w:tcPr>
-            <w:tcBorders>
-              <w:bottom w:val="single" w:sz="8" w:space="0" w:color="000000"/>
-              <w:top w:val="none" w:sz="0" w:space="0" w:color="000000"/>
-              <w:left w:val="none" w:sz="0" w:space="0" w:color="000000"/>
-              <w:right w:val="none" w:sz="0" w:space="0" w:color="000000"/>
-            </w:tcBorders>
-            <w:shd w:val="clear" w:color="auto" w:fill="FFFFFF"/>
-            <w:tcMar>
-              <w:top w:w="0" w:type="dxa"/>
-              <w:bottom w:w="0" w:type="dxa"/>
-              <w:left w:w="0" w:type="dxa"/>
-              <w:right w:w="0" w:type="dxa"/>
-            </w:tcMar>
-            <w:vAlign w:val="top"/>
-          </w:tcPr>
-          <w:p>
-            <w:pPr>
-              <w:pStyle w:val="Normal"/>
-              <w:jc w:val="left"/>
-              <w:pBdr>
-                <w:bottom w:val="none" w:sz="0" w:space="0" w:color="000000"/>
-                <w:top w:val="none" w:sz="0" w:space="0" w:color="000000"/>
-                <w:left w:val="none" w:sz="0" w:space="0" w:color="000000"/>
-                <w:right w:val="none" w:sz="0" w:space="0" w:color="000000"/>
-              </w:pBdr>
-              <w:spacing w:after="100" w:before="100" w:line="240"/>
-              <w:ind w:left="300" w:right="100" w:firstLine="0" w:firstLineChars="0"/>
-              <w:rPr>
-                <w:rFonts w:ascii="Helvetica" w:hAnsi="Helvetica" w:eastAsia="Helvetica" w:cs="Helvetica"/>
-                <w:i w:val="false"/>
-                <w:b w:val="false"/>
-                <w:u w:val="none"/>
-                <w:strike w:val="false"/>
-                <w:sz w:val="22"/>
-                <w:szCs w:val="22"/>
-                <w:color w:val="000000"/>
-              </w:rPr>
-            </w:pPr>
-            <w:r>
-              <w:rPr>
-                <w:rFonts w:ascii="Helvetica" w:hAnsi="Helvetica" w:eastAsia="Helvetica" w:cs="Helvetica"/>
-                <w:i w:val="false"/>
-                <w:b w:val="false"/>
-                <w:u w:val="none"/>
-                <w:strike w:val="false"/>
-                <w:sz w:val="22"/>
-                <w:szCs w:val="22"/>
-                <w:color w:val="000000"/>
-              </w:rPr>
-              <w:t xml:space="preserve">Missing</w:t>
-            </w:r>
-          </w:p>
-        </w:tc>
-        <w:tc>
-          <w:tcPr>
-            <w:tcBorders>
-              <w:bottom w:val="single" w:sz="8" w:space="0" w:color="000000"/>
-              <w:top w:val="none" w:sz="0" w:space="0" w:color="000000"/>
-              <w:left w:val="none" w:sz="0" w:space="0" w:color="000000"/>
-              <w:right w:val="none" w:sz="0" w:space="0" w:color="000000"/>
-            </w:tcBorders>
-            <w:shd w:val="clear" w:color="auto" w:fill="FFFFFF"/>
-            <w:tcMar>
-              <w:top w:w="0" w:type="dxa"/>
-              <w:bottom w:w="0" w:type="dxa"/>
-              <w:left w:w="0" w:type="dxa"/>
-              <w:right w:w="0" w:type="dxa"/>
-            </w:tcMar>
-            <w:vAlign w:val="top"/>
-          </w:tcPr>
-          <w:p>
-            <w:pPr>
-              <w:pStyle w:val="Normal"/>
-              <w:jc w:val="center"/>
-              <w:pBdr>
-                <w:bottom w:val="none" w:sz="0" w:space="0" w:color="000000"/>
-                <w:top w:val="none" w:sz="0" w:space="0" w:color="000000"/>
-                <w:left w:val="none" w:sz="0" w:space="0" w:color="000000"/>
-                <w:right w:val="none" w:sz="0" w:space="0" w:color="000000"/>
-              </w:pBdr>
-              <w:spacing w:after="100" w:before="100" w:line="240"/>
-              <w:ind w:left="100" w:right="100" w:firstLine="0" w:firstLineChars="0"/>
-              <w:rPr>
-                <w:rFonts w:ascii="Helvetica" w:hAnsi="Helvetica" w:eastAsia="Helvetica" w:cs="Helvetica"/>
-                <w:i w:val="false"/>
-                <w:b w:val="false"/>
-                <w:u w:val="none"/>
-                <w:strike w:val="false"/>
-                <w:sz w:val="22"/>
-                <w:szCs w:val="22"/>
-                <w:color w:val="000000"/>
-              </w:rPr>
-            </w:pPr>
-            <w:r>
-              <w:rPr>
-                <w:rFonts w:ascii="Helvetica" w:hAnsi="Helvetica" w:eastAsia="Helvetica" w:cs="Helvetica"/>
-                <w:i w:val="false"/>
-                <w:b w:val="false"/>
-                <w:u w:val="none"/>
-                <w:strike w:val="false"/>
-                <w:sz w:val="22"/>
-                <w:szCs w:val="22"/>
-                <w:color w:val="000000"/>
-              </w:rPr>
-              <w:t xml:space="preserve">1 (&lt;0.1%)</w:t>
             </w:r>
           </w:p>
         </w:tc>

</xml_diff>